<commit_message>
checked against full program in input
</commit_message>
<xml_diff>
--- a/Program2/docs/P2-G1-Tasklist.docx
+++ b/Program2/docs/P2-G1-Tasklist.docx
@@ -4,13 +4,24 @@
   <w:body>
     <w:p>
       <w:r>
-        <w:t xml:space="preserve">Assignment:  </w:t>
+        <w:t>Assignment</w:t>
+      </w:r>
+      <w:proofErr w:type="gramStart"/>
+      <w:r>
+        <w:t xml:space="preserve">:  </w:t>
       </w:r>
       <w:r>
         <w:rPr>
           <w:u w:val="single"/>
         </w:rPr>
-        <w:t>Program 2: Scanner</w:t>
+        <w:t>Program</w:t>
+      </w:r>
+      <w:proofErr w:type="gramEnd"/>
+      <w:r>
+        <w:rPr>
+          <w:u w:val="single"/>
+        </w:rPr>
+        <w:t xml:space="preserve"> 2: Scanner</w:t>
       </w:r>
     </w:p>
     <w:p>
@@ -20,18 +31,33 @@
         </w:rPr>
       </w:pPr>
       <w:r>
-        <w:t xml:space="preserve">Class:  </w:t>
+        <w:t>Class</w:t>
+      </w:r>
+      <w:proofErr w:type="gramStart"/>
+      <w:r>
+        <w:t xml:space="preserve">:  </w:t>
       </w:r>
       <w:r>
         <w:rPr>
           <w:u w:val="single"/>
         </w:rPr>
-        <w:t>Language Translation</w:t>
+        <w:t>Language</w:t>
+      </w:r>
+      <w:proofErr w:type="gramEnd"/>
+      <w:r>
+        <w:rPr>
+          <w:u w:val="single"/>
+        </w:rPr>
+        <w:t xml:space="preserve"> Translation</w:t>
       </w:r>
     </w:p>
     <w:p>
       <w:r>
-        <w:t xml:space="preserve">Group number:  </w:t>
+        <w:t>Group number</w:t>
+      </w:r>
+      <w:proofErr w:type="gramStart"/>
+      <w:r>
+        <w:t xml:space="preserve">:  </w:t>
       </w:r>
       <w:r>
         <w:rPr>
@@ -39,6 +65,7 @@
         </w:rPr>
         <w:t>1</w:t>
       </w:r>
+      <w:proofErr w:type="gramEnd"/>
     </w:p>
     <w:tbl>
       <w:tblPr>
@@ -119,7 +146,15 @@
               <w:t>, add group header</w:t>
             </w:r>
             <w:r>
-              <w:t>, token enum, scanner function/ helpers, program organization</w:t>
+              <w:t xml:space="preserve">, token </w:t>
+            </w:r>
+            <w:proofErr w:type="spellStart"/>
+            <w:r>
+              <w:t>enum</w:t>
+            </w:r>
+            <w:proofErr w:type="spellEnd"/>
+            <w:r>
+              <w:t>, scanner function/ helpers, program organization</w:t>
             </w:r>
           </w:p>
         </w:tc>

</xml_diff>